<commit_message>
Change color down there” & REM…
</commit_message>
<xml_diff>
--- a/__HM_Notes/Tricks to make this work.docx
+++ b/__HM_Notes/Tricks to make this work.docx
@@ -6,13 +6,8 @@
       <w:pPr>
         <w:pStyle w:val="Heading1"/>
       </w:pPr>
-      <w:proofErr w:type="spellStart"/>
-      <w:r>
-        <w:t>Commiting</w:t>
-      </w:r>
-      <w:proofErr w:type="spellEnd"/>
-      <w:r>
-        <w:t xml:space="preserve"> changes</w:t>
+      <w:r>
+        <w:t>Commiting changes</w:t>
       </w:r>
     </w:p>
     <w:p>
@@ -21,50 +16,76 @@
       </w:r>
     </w:p>
     <w:p>
-      <w:r>
-        <w:t>git add -</w:t>
-      </w:r>
-      <w:proofErr w:type="gramStart"/>
-      <w:r>
-        <w:t>A   # -</w:t>
-      </w:r>
-      <w:proofErr w:type="gramEnd"/>
-      <w:r>
-        <w:t>A means "</w:t>
-      </w:r>
-      <w:proofErr w:type="gramStart"/>
-      <w:r>
-        <w:t>All" —</w:t>
-      </w:r>
-      <w:proofErr w:type="gramEnd"/>
-      <w:r>
-        <w:t xml:space="preserve"> stage every changed, new, or deleted file</w:t>
+      <w:pPr>
+        <w:rPr>
+          <w:color w:val="EE0000"/>
+        </w:rPr>
+      </w:pPr>
+      <w:r>
+        <w:t xml:space="preserve">git add -A </w:t>
+      </w:r>
+      <w:r>
+        <w:rPr>
+          <w:color w:val="EE0000"/>
+        </w:rPr>
+        <w:t>&amp; REM -A means "All" - stage every changed, new, or deleted fi</w:t>
+      </w:r>
+      <w:r>
+        <w:rPr>
+          <w:color w:val="EE0000"/>
+        </w:rPr>
+        <w:t>l</w:t>
+      </w:r>
+      <w:r>
+        <w:rPr>
+          <w:color w:val="EE0000"/>
+        </w:rPr>
+        <w:t>e</w:t>
       </w:r>
     </w:p>
     <w:p>
       <w:r>
-        <w:t xml:space="preserve">git commit -m "Add new </w:t>
-      </w:r>
-      <w:proofErr w:type="gramStart"/>
-      <w:r>
-        <w:t>publications"   #</w:t>
-      </w:r>
-      <w:proofErr w:type="gramEnd"/>
-      <w:r>
-        <w:t xml:space="preserve"> takes a snapshot of what's staged</w:t>
+        <w:t>git commit -m "Add new publications</w:t>
+      </w:r>
+      <w:r>
+        <w:t xml:space="preserve">” </w:t>
+      </w:r>
+      <w:r>
+        <w:rPr>
+          <w:color w:val="EE0000"/>
+        </w:rPr>
+        <w:t>&amp; REM</w:t>
+      </w:r>
+      <w:r>
+        <w:rPr>
+          <w:color w:val="EE0000"/>
+        </w:rPr>
+        <w:t>… change the commit message depending on what you did</w:t>
       </w:r>
     </w:p>
     <w:p>
       <w:r>
-        <w:t xml:space="preserve">git push   # sends the snapshot to GitHub, which triggers the site </w:t>
-      </w:r>
-      <w:proofErr w:type="gramStart"/>
-      <w:r>
-        <w:t>rebuild</w:t>
-      </w:r>
-      <w:proofErr w:type="gramEnd"/>
+        <w:t xml:space="preserve">git push   </w:t>
+      </w:r>
+      <w:r>
+        <w:rPr>
+          <w:color w:val="EE0000"/>
+        </w:rPr>
+        <w:t>&amp; REM</w:t>
+      </w:r>
+      <w:r>
+        <w:rPr>
+          <w:color w:val="EE0000"/>
+        </w:rPr>
+        <w:t xml:space="preserve">… </w:t>
+      </w:r>
+      <w:r>
+        <w:rPr>
+          <w:color w:val="EE0000"/>
+        </w:rPr>
+        <w:t>push it to GitHub!</w:t>
+      </w:r>
     </w:p>
-    <w:p/>
     <w:p>
       <w:pPr>
         <w:pStyle w:val="Heading1"/>
@@ -746,6 +767,7 @@
   <w:style w:type="character" w:default="1" w:styleId="DefaultParagraphFont">
     <w:name w:val="Default Paragraph Font"/>
     <w:uiPriority w:val="1"/>
+    <w:semiHidden/>
     <w:unhideWhenUsed/>
   </w:style>
   <w:style w:type="table" w:default="1" w:styleId="TableNormal">

</xml_diff>